<commit_message>
Add GARI consultant review status page
</commit_message>
<xml_diff>
--- a/clients/gari-consultant/GARI-Website-Review-Developer-Response.docx
+++ b/clients/gari-consultant/GARI-Website-Review-Developer-Response.docx
@@ -89,7 +89,7 @@
           <w:szCs w:val="20"/>
           <w:rFonts w:ascii="Calibri" w:hAnsi="Calibri"/>
         </w:rPr>
-        <w:t xml:space="preserve">Done and live on the site now. 18 points.</w:t>
+        <w:t xml:space="preserve">Done and live on the site now. 19 points.</w:t>
       </w:r>
     </w:p>
     <w:p>
@@ -117,7 +117,7 @@
           <w:szCs w:val="20"/>
           <w:rFonts w:ascii="Calibri" w:hAnsi="Calibri"/>
         </w:rPr>
-        <w:t xml:space="preserve">Partly done, or waiting on information from GARI. 10 points.</w:t>
+        <w:t xml:space="preserve">Partly done, or waiting on information from GARI. 9 points.</w:t>
       </w:r>
     </w:p>
     <w:p>
@@ -4415,27 +4415,27 @@
         <w:spacing w:before="80" w:after="200"/>
         <w:ind w:left="0" w:firstLine="0"/>
         <w:pBdr>
-          <w:left w:val="single" w:sz="18" w:space="6" w:color="9A6700"/>
+          <w:left w:val="single" w:sz="18" w:space="6" w:color="1E7A34"/>
         </w:pBdr>
       </w:pPr>
       <w:r>
         <w:rPr>
           <w:b/>
-          <w:color w:val="9A6700"/>
+          <w:color w:val="1E7A34"/>
           <w:sz w:val="19"/>
           <w:szCs w:val="19"/>
           <w:rFonts w:ascii="Calibri" w:hAnsi="Calibri"/>
         </w:rPr>
-        <w:t xml:space="preserve">PARTLY DONE: </w:t>
-      </w:r>
-      <w:r>
-        <w:rPr>
-          <w:color w:val="9A6700"/>
+        <w:t xml:space="preserve">DONE: </w:t>
+      </w:r>
+      <w:r>
+        <w:rPr>
+          <w:color w:val="1E7A34"/>
           <w:sz w:val="19"/>
           <w:szCs w:val="19"/>
           <w:rFonts w:ascii="Calibri" w:hAnsi="Calibri"/>
         </w:rPr>
-        <w:t xml:space="preserve">Every image now has alt text. The four service icons are stock shapes in four unrelated colours and need proper icons. Please send icons, or approve us sourcing a matching set.</w:t>
+        <w:t xml:space="preserve">Every image now has alt text, where previously not one image on the site had any. The four service icons have been replaced with a matching line icon set, shown white on the dark home page section and black on What We Do, and all cards use the same corner radius.</w:t>
       </w:r>
     </w:p>
     <w:p>

</xml_diff>